<commit_message>
court(moctappwd): second pass on the shared model at HEAD; opening-brief gated, answering latex, amicus docx, petition latex gated (fb-595.54.70)
Co-Authored-By: Claude Opus 5.5 <noreply@anthropic.com>
</commit_message>
<xml_diff>
--- a/courts/eighth-circuit/missouri/state/court-of-appeals-western-district/amicus-brief/usage/OUTPUT-amicus-brief.docx
+++ b/courts/eighth-circuit/missouri/state/court-of-appeals-western-district/amicus-brief/usage/OUTPUT-amicus-brief.docx
@@ -10633,19 +10633,13 @@
         <w:t xml:space="preserve"> </w:t>
       </w:r>
       <w:r>
-        <w:t xml:space="preserve">“because of such individual’s . . . sex[.]”</w:t>
-      </w:r>
-      <w:r>
-        <w:t xml:space="preserve"> </w:t>
-      </w:r>
-      <w:r>
-        <w:t xml:space="preserve">42 U.S.C. § 2000e</w:t>
-      </w:r>
-      <w:r>
-        <w:noBreakHyphen/>
-      </w:r>
-      <w:r>
-        <w:t xml:space="preserve">2(a)⁠(1);</w:t>
+        <w:t xml:space="preserve">“because of such individual’s . . . sex[.]”</w:t>
+      </w:r>
+      <w:r>
+        <w:t xml:space="preserve"> </w:t>
+      </w:r>
+      <w:r>
+        <w:t xml:space="preserve">42 U.S.C. § 2000e-⁠2(a)⁠(1);</w:t>
       </w:r>
       <w:r>
         <w:t xml:space="preserve"> </w:t>
@@ -11517,7 +11511,7 @@
         <w:t xml:space="preserve"> </w:t>
       </w:r>
       <w:r>
-        <w:t xml:space="preserve">“employers who discriminate against men because they . . . act femininely, are also engaging in sex discrimination, because the discrimination would not occur but for the victim’s sex”</w:t>
+        <w:t xml:space="preserve">“employers who discriminate against men because they . . . act femininely, are also engaging in sex discrimination, because the discrimination would not occur but for the victim’s sex”</w:t>
       </w:r>
       <w:r>
         <w:t xml:space="preserve">);</w:t>
@@ -14565,7 +14559,7 @@
         <w:t xml:space="preserve"> </w:t>
       </w:r>
       <w:r>
-        <w:t xml:space="preserve">http://www.eeoc.gov/​eeoc/​plan/​sep.cfm, at section III.B.3. The agency’s publication on its website of its federal sector rulings serves to educate employers and employees regarding Title VII’s coverage of certain claims of sexual orientation discrimination.</w:t>
+        <w:t xml:space="preserve">http://​www.​eeoc.​gov/​eeoc/​plan/​sep.​cfm, at section III.B.3. The agency’s publication on its website of its federal sector rulings serves to educate employers and employees regarding Title VII’s coverage of certain claims of sexual orientation discrimination.</w:t>
       </w:r>
       <w:r>
         <w:t xml:space="preserve"> </w:t>
@@ -14609,7 +14603,7 @@
         <w:t xml:space="preserve"> </w:t>
       </w:r>
       <w:r>
-        <w:t xml:space="preserve">http://www.eeoc.gov/​federal/​directives/​lgbt complaint processing.cfm. Finally, the EEOC has reached out specifically to encourage lesbian, gay, bisexual and transgender victims of employment discrimination to report it to the EEOC, because of its coverage under Title VII.</w:t>
+        <w:t xml:space="preserve">http://​www.​eeoc.​gov/​federal/​directives/​lgbt complaint processing.cfm. Finally, the EEOC has reached out specifically to encourage lesbian, gay, bisexual and transgender victims of employment discrimination to report it to the EEOC, because of its coverage under Title VII.</w:t>
       </w:r>
       <w:r>
         <w:t xml:space="preserve"> </w:t>
@@ -14653,7 +14647,7 @@
         <w:t xml:space="preserve"> </w:t>
       </w:r>
       <w:r>
-        <w:t xml:space="preserve">http://www.eeoc.gov/​eeoc/​publications/​brochure-gender_stereotyping.cfm;</w:t>
+        <w:t xml:space="preserve">http://​www.​eeoc.​gov/​eeoc/​publications/​brochure-​gender_stereotyping.​cfm;</w:t>
       </w:r>
       <w:r>
         <w:t xml:space="preserve"> </w:t>
@@ -14691,7 +14685,7 @@
         <w:t xml:space="preserve"> </w:t>
       </w:r>
       <w:r>
-        <w:t xml:space="preserve">https://s3.amazonaws.com/​s3.documentcloud.org/​documents/1670449/​eeoc-lgbt-field-guidance.pdf (advising that complaints of discrimination based on transgender status, gender identity, or sexual orientation</w:t>
+        <w:t xml:space="preserve">https://​s3.​amazonaws.​com/​s3.​documentcloud.​org/​documents/​1670449/​eeoc-​lgbt-​field-​guidance.​pdf (advising that complaints of discrimination based on transgender status, gender identity, or sexual orientation</w:t>
       </w:r>
       <w:r>
         <w:t xml:space="preserve"> </w:t>
@@ -14748,7 +14742,7 @@
         <w:t xml:space="preserve"> </w:t>
       </w:r>
       <w:r>
-        <w:t xml:space="preserve">http://www.eeoc.gov/​eeoc/​publications/​brochure-gender_stereotyping.cfm, when evaluating the question of whether the MHRA protects lesbians and gay men from impermissible sex discrimination.</w:t>
+        <w:t xml:space="preserve">http://​www.​eeoc.​gov/​eeoc/​publications/​brochure-​gender_stereotyping.​cfm, when evaluating the question of whether the MHRA protects lesbians and gay men from impermissible sex discrimination.</w:t>
       </w:r>
     </w:p>
     <w:p>
@@ -16392,7 +16386,7 @@
         <w:t xml:space="preserve"> </w:t>
       </w:r>
       <w:r>
-        <w:t xml:space="preserve">“[i]t shall be an unlawful employment practice … [f]or an employer . . . to discriminate against any individual with respect to his compensation, terms, conditions, or privileges of employment, because of such individual’s race, color, religion, national origin, sex, ancestry, age or disability[.]”</w:t>
+        <w:t xml:space="preserve">“[i]t shall be an unlawful employment practice … [f]or an employer . . . to discriminate against any individual with respect to his compensation, terms, conditions, or privileges of employment, because of such individual’s race, color, religion, national origin, sex, ancestry, age or disability[.]”</w:t>
       </w:r>
       <w:r>
         <w:t xml:space="preserve"> </w:t>
@@ -16410,19 +16404,13 @@
         <w:t xml:space="preserve"> </w:t>
       </w:r>
       <w:r>
-        <w:t xml:space="preserve">“[i]t shall be an unlawful employment practice for an employer . . . to discriminate against any individual with respect to his compensation, terms, conditions, or privileges of employment, because of such individual’s race, color, religion, sex, or national origin[.]”</w:t>
-      </w:r>
-      <w:r>
-        <w:t xml:space="preserve"> </w:t>
-      </w:r>
-      <w:r>
-        <w:t xml:space="preserve">42 U.S.C. § 2000e</w:t>
-      </w:r>
-      <w:r>
-        <w:noBreakHyphen/>
-      </w:r>
-      <w:r>
-        <w:t xml:space="preserve">2(a)⁠(1).</w:t>
+        <w:t xml:space="preserve">“[i]t shall be an unlawful employment practice for an employer . . . to discriminate against any individual with respect to his compensation, terms, conditions, or privileges of employment, because of such individual’s race, color, religion, sex, or national origin[.]”</w:t>
+      </w:r>
+      <w:r>
+        <w:t xml:space="preserve"> </w:t>
+      </w:r>
+      <w:r>
+        <w:t xml:space="preserve">42 U.S.C. § 2000e-⁠2(a)⁠(1).</w:t>
       </w:r>
     </w:p>
   </w:footnote>
@@ -16674,7 +16662,7 @@
         <w:t xml:space="preserve"> </w:t>
       </w:r>
       <w:r>
-        <w:t xml:space="preserve">http://www.apa.org/​topics/​lgbt/​orientation.aspx.</w:t>
+        <w:t xml:space="preserve">http://​www.​apa.​org/​topics/​lgbt/​orientation.​aspx.</w:t>
       </w:r>
     </w:p>
   </w:footnote>
@@ -17416,6 +17404,7 @@
     <w:unhideWhenUsed/>
     <w:qFormat/>
     <w:pPr>
+      <w:keepLines/>
       <w:spacing w:before="0" w:after="140" w:line="299" w:lineRule="exact"/>
     </w:pPr>
     <w:rPr>
@@ -17666,6 +17655,33 @@
     <w:pPr>
       <w:spacing w:before="0" w:after="0" w:line="299" w:lineRule="exact"/>
       <w:ind w:left="2160" w:hanging="720"/>
+    </w:pPr>
+  </w:style>
+  <w:style w:type="paragraph" w:customStyle="1" w:styleId="XdQuoteList1">
+    <w:name w:val="Xd Quote List 1"/>
+    <w:basedOn w:val="Normal"/>
+    <w:qFormat/>
+    <w:pPr>
+      <w:spacing w:before="0" w:after="0" w:line="299" w:lineRule="exact"/>
+      <w:ind w:left="1440" w:right="720" w:hanging="720"/>
+    </w:pPr>
+  </w:style>
+  <w:style w:type="paragraph" w:customStyle="1" w:styleId="XdQuoteList2">
+    <w:name w:val="Xd Quote List 2"/>
+    <w:basedOn w:val="Normal"/>
+    <w:qFormat/>
+    <w:pPr>
+      <w:spacing w:before="0" w:after="0" w:line="299" w:lineRule="exact"/>
+      <w:ind w:left="2160" w:right="720" w:hanging="720"/>
+    </w:pPr>
+  </w:style>
+  <w:style w:type="paragraph" w:customStyle="1" w:styleId="XdQuoteList3">
+    <w:name w:val="Xd Quote List 3"/>
+    <w:basedOn w:val="Normal"/>
+    <w:qFormat/>
+    <w:pPr>
+      <w:spacing w:before="0" w:after="0" w:line="299" w:lineRule="exact"/>
+      <w:ind w:left="2880" w:right="720" w:hanging="720"/>
     </w:pPr>
   </w:style>
   <w:style w:type="paragraph" w:customStyle="1" w:styleId="XdTail">

</xml_diff>